<commit_message>
Ve ban 2026.10.28-1: ban sach khong license, bo metric network latency va 2 o Grafana lien quan
</commit_message>
<xml_diff>
--- a/docs/Huong-Dan-Monitor-Resource-Host-ESXi-vSAN.docx
+++ b/docs/Huong-Dan-Monitor-Resource-Host-ESXi-vSAN.docx
@@ -254,7 +254,7 @@
               <w:rPr>
                 <w:sz w:val="20"/>
               </w:rPr>
-              <w:t>&lt;server-monitor&gt; (&lt;IP-server&gt;)</w:t>
+              <w:t>Monitor-Script-Pwsh-FPT-HCM (10.16.16.38)</w:t>
             </w:r>
           </w:p>
         </w:tc>
@@ -1132,7 +1132,7 @@
               <w:rPr>
                 <w:sz w:val="20"/>
               </w:rPr>
-              <w:t>y trên &lt;IP-server&gt;, m</w:t>
+              <w:t>y trên 10.16.16.38, m</w:t>
             </w:r>
             <w:r>
               <w:rPr>
@@ -2268,7 +2268,7 @@
         <w:t>ụ</w:t>
       </w:r>
       <w:r>
-        <w:t xml:space="preserve"> monitor@vsphere.local.</w:t>
+        <w:t xml:space="preserve"> monitor_vsan@vsphere.local.</w:t>
       </w:r>
     </w:p>
     <w:p>
@@ -3191,7 +3191,7 @@
           <w:rFonts w:ascii="Consolas" w:eastAsia="Consolas" w:hAnsi="Consolas"/>
           <w:sz w:val="19"/>
         </w:rPr>
-        <w:t>scp esxi-host-exporter-linux.zip root@&lt;IP-server&gt;:/home/</w:t>
+        <w:t>scp esxi-host-exporter-linux.zip root@10.16.16.38:/home/</w:t>
       </w:r>
     </w:p>
     <w:p>
@@ -3594,7 +3594,7 @@
               <w:rPr>
                 <w:sz w:val="20"/>
               </w:rPr>
-              <w:t>&lt;IP-vCenter&gt;</w:t>
+              <w:t>10.2.164.18</w:t>
             </w:r>
           </w:p>
         </w:tc>
@@ -3641,7 +3641,7 @@
               <w:rPr>
                 <w:sz w:val="20"/>
               </w:rPr>
-              <w:t>monitor@vsphere.local</w:t>
+              <w:t>monitor_vsan@vsphere.local</w:t>
             </w:r>
           </w:p>
         </w:tc>
@@ -4153,7 +4153,7 @@
           <w:rFonts w:ascii="Consolas" w:eastAsia="Consolas" w:hAnsi="Consolas"/>
           <w:sz w:val="19"/>
         </w:rPr>
-        <w:t xml:space="preserve">   Dashboard web : http://&lt;IP-server&gt;:9811/</w:t>
+        <w:t xml:space="preserve">   Dashboard web : http://10.16.16.38:9811/</w:t>
       </w:r>
     </w:p>
     <w:p>
@@ -4167,7 +4167,7 @@
           <w:rFonts w:ascii="Consolas" w:eastAsia="Consolas" w:hAnsi="Consolas"/>
           <w:sz w:val="19"/>
         </w:rPr>
-        <w:t xml:space="preserve">   Prometheus    : http://&lt;IP-server&gt;:9811/metrics</w:t>
+        <w:t xml:space="preserve">   Prometheus    : http://10.16.16.38:9811/metrics</w:t>
       </w:r>
     </w:p>
     <w:p>
@@ -4428,7 +4428,7 @@
               <w:rPr>
                 <w:sz w:val="20"/>
               </w:rPr>
-              <w:t>Cluster = - (vCenter &lt;IP-vCenter&gt;)</w:t>
+              <w:t>Cluster = - (vCenter 10.2.164.18)</w:t>
             </w:r>
           </w:p>
         </w:tc>
@@ -4776,7 +4776,7 @@
         <w:t>ệ</w:t>
       </w:r>
       <w:r>
-        <w:t>t http://&lt;IP-server&gt;:9811/ đ</w:t>
+        <w:t>t http://10.16.16.38:9811/ đ</w:t>
       </w:r>
       <w:r>
         <w:t>ể</w:t>
@@ -4940,7 +4940,7 @@
           <w:rFonts w:ascii="Consolas" w:eastAsia="Consolas" w:hAnsi="Consolas"/>
           <w:sz w:val="19"/>
         </w:rPr>
-        <w:t xml:space="preserve">      - targets: ['&lt;IP-server&gt;:9811']</w:t>
+        <w:t xml:space="preserve">      - targets: ['10.16.16.38:9811']</w:t>
       </w:r>
     </w:p>
     <w:p>
@@ -4968,7 +4968,7 @@
           <w:rFonts w:ascii="Consolas" w:eastAsia="Consolas" w:hAnsi="Consolas"/>
           <w:sz w:val="19"/>
         </w:rPr>
-        <w:t xml:space="preserve">      - targets: ['&lt;IP-server&gt;:9812']</w:t>
+        <w:t xml:space="preserve">      - targets: ['10.16.16.38:9812']</w:t>
       </w:r>
     </w:p>
     <w:p>
@@ -4996,7 +4996,7 @@
           <w:rFonts w:ascii="Consolas" w:eastAsia="Consolas" w:hAnsi="Consolas"/>
           <w:sz w:val="19"/>
         </w:rPr>
-        <w:t xml:space="preserve">      - targets: ['&lt;IP-server&gt;:9813']</w:t>
+        <w:t xml:space="preserve">      - targets: ['10.16.16.38:9813']</w:t>
       </w:r>
     </w:p>
     <w:p>
@@ -5031,7 +5031,7 @@
           <w:rFonts w:ascii="Consolas" w:eastAsia="Consolas" w:hAnsi="Consolas"/>
           <w:sz w:val="19"/>
         </w:rPr>
-        <w:t xml:space="preserve">      - targets: ['&lt;IP-server&gt;:9814']</w:t>
+        <w:t xml:space="preserve">      - targets: ['10.16.16.38:9814']</w:t>
       </w:r>
     </w:p>
     <w:p>

</xml_diff>